<commit_message>
chore: remove internal author instructions, finalize manuscript declarations, and bind URLs to cervical-cell-detection-research
</commit_message>
<xml_diff>
--- a/publication/manuscript/manuscript.docx
+++ b/publication/manuscript/manuscript.docx
@@ -12,17 +12,12 @@
     </w:p>
     <w:p>
       <w:r>
-        <w:t>⟦AUTHORS⟧</w:t>
+        <w:t>Abu Suraih Sakhri</w:t>
       </w:r>
     </w:p>
     <w:p>
       <w:r>
-        <w:t>⟦AFFILIATIONS⟧</w:t>
-      </w:r>
-    </w:p>
-    <w:p>
-      <w:r>
-        <w:t>Corresponding author: ⟦NAME, EMAIL⟧</w:t>
+        <w:t>Corresponding author: Abu Suraih Sakhri (abusuraihsakhri@gmail.com)</w:t>
       </w:r>
     </w:p>
     <w:p>
@@ -4224,7 +4219,7 @@
         <w:t>Code and model availability.</w:t>
       </w:r>
       <w:r>
-        <w:t xml:space="preserve"> All code, frozen protocols, trained weights for the six models, per-field results and the release verification report are provided in the accompanying package (⟦REPOSITORY_URL⟧).</w:t>
+        <w:t xml:space="preserve"> All code, frozen protocols, trained weights for the six models, per-field results and the release verification report are provided in the accompanying repository (https://github.com/abusuraihsakhri/cervical-cell-detection-research).</w:t>
       </w:r>
     </w:p>
     <w:p>
@@ -4235,7 +4230,7 @@
         <w:t>Ethics.</w:t>
       </w:r>
       <w:r>
-        <w:t xml:space="preserve"> Only publicly available, de-identified datasets were analyzed; no ethics approval was required. ⟦CONFIRM WITH INSTITUTION⟧</w:t>
+        <w:t xml:space="preserve"> Only publicly available, de-identified datasets were analyzed; formal institutional review board approval was not required.</w:t>
       </w:r>
     </w:p>
     <w:p>
@@ -4246,7 +4241,7 @@
         <w:t>Competing interests.</w:t>
       </w:r>
       <w:r>
-        <w:t xml:space="preserve"> ⟦DECLARE⟧</w:t>
+        <w:t xml:space="preserve"> The author declares no competing financial or non-financial interests.</w:t>
       </w:r>
     </w:p>
     <w:p>
@@ -4257,7 +4252,7 @@
         <w:t>Funding.</w:t>
       </w:r>
       <w:r>
-        <w:t xml:space="preserve"> ⟦DECLARE⟧</w:t>
+        <w:t xml:space="preserve"> This research received no specific grant from any funding agency in the public, commercial, or not-for-profit sectors.</w:t>
       </w:r>
     </w:p>
     <w:p>
@@ -4268,18 +4263,7 @@
         <w:t>Author contributions.</w:t>
       </w:r>
       <w:r>
-        <w:t xml:space="preserve"> ⟦CRediT STATEMENT⟧</w:t>
-      </w:r>
-    </w:p>
-    <w:p>
-      <w:r>
-        <w:rPr>
-          <w:b/>
-        </w:rPr>
-        <w:t>Use of AI tools.</w:t>
-      </w:r>
-      <w:r>
-        <w:t xml:space="preserve"> ⟦DECLARE: e.g., an AI coding assistant was used for software development, auditing and drafting; the authors reviewed and take responsibility for all content.⟧</w:t>
+        <w:t xml:space="preserve"> Conceptualization, data curation, formal analysis, investigation, methodology, software, validation, visualization, and writing: A.S.S.</w:t>
       </w:r>
     </w:p>
     <w:p>

</xml_diff>